<commit_message>
Ensure fully deterministic ZIP output across net48 and net10.0
  - Replace framework ZipArchive writing with raw ZipStorer to guarantee
    compression method 0 (Stored) on all frameworks (net48 ignores
    CompressionLevel.NoCompression)
  - Write raw zlib stored blocks in PngNormalizer to avoid DEFLATE
    differences between framework ZLibStream implementations
  - Sort ZIP entries by name using ordinal comparison
  - Sort [Content_Types].xml elements deterministically (ContentTypesPatcher)
  - Renumber all relationship IDs in .rels files to DeterministicId{n} and
    remap corresponding r:id references in content XML
  - Add verification tests for stored entries, deterministic relationship
    IDs, and sorted content types
</commit_message>
<xml_diff>
--- a/src/Tests/Tests.Numbering.Net.verified.docx
+++ b/src/Tests/Tests.Numbering.Net.verified.docx
@@ -363,7 +363,7 @@
           <w:sz w:val="21"/>
         </w:rPr>
       </w:pPr>
-      <w:hyperlink r:id="rId4">
+      <w:hyperlink r:id="DeterministicId3">
         <w:r>
           <w:rPr>
             <w:rStyle w:val="InternetLink"/>
@@ -497,7 +497,7 @@
             <wp:cNvGraphicFramePr/>
             <a:graphic xmlns:a="http://schemas.openxmlformats.org/drawingml/2006/main">
               <a:graphicData uri="http://schemas.openxmlformats.org/drawingml/2006/chart">
-                <c:chart xmlns:c="http://schemas.openxmlformats.org/drawingml/2006/chart" xmlns:r="http://schemas.openxmlformats.org/officeDocument/2006/relationships" r:id="rId5"/>
+                <c:chart xmlns:c="http://schemas.openxmlformats.org/drawingml/2006/chart" xmlns:r="http://schemas.openxmlformats.org/officeDocument/2006/relationships" r:id="DeterministicId1"/>
               </a:graphicData>
             </a:graphic>
           </wp:inline>

</xml_diff>